<commit_message>
Corrige BAK corpo templates: substitui 'por meio digital' por 'em «TIPO_ASS»'
https://claude.ai/code/session_01L1sfwnXz59t3NvQDJuRWQR
</commit_message>
<xml_diff>
--- a/template/supabase-files/BAK corpo_cabeca.docx
+++ b/template/supabase-files/BAK corpo_cabeca.docx
@@ -11632,7 +11632,7 @@
         <w:rPr>
           <w:rFonts w:ascii="Calibri" w:hAnsi="Calibri"/>
         </w:rPr>
-        <w:t>por meio digital</w:t>
+        <w:t>em «TIPO_ASS»</w:t>
       </w:r>
       <w:r>
         <w:rPr>
@@ -11705,14 +11705,6 @@
           <w:rFonts w:ascii="Calibri" w:hAnsi="Calibri"/>
         </w:rPr>
         <w:t>.</w:t>
-      </w:r>
-    </w:p>
-    <w:p>
-      <w:r>
-        <w:t xml:space="preserve"> </w:t>
-      </w:r>
-      <w:r>
-        <w:t>«TIPO_ASS»</w:t>
       </w:r>
     </w:p>
     <w:p>

</xml_diff>